<commit_message>
Fix cover page details in Pranav_ProjectReport.docx: update Department to Electronics and Telecommunication Engineering, remove Domain and Academic Year fields
</commit_message>
<xml_diff>
--- a/Pranav_ProjectReport.docx
+++ b/Pranav_ProjectReport.docx
@@ -170,87 +170,7 @@
           </w:tcPr>
           <w:p>
             <w:r>
-              <w:t>Computer Science &amp; Engineering / Data Science</w:t>
-            </w:r>
-          </w:p>
-        </w:tc>
-      </w:tr>
-      <w:tr>
-        <w:tc>
-          <w:tcPr>
-            <w:tcW w:type="dxa" w:w="3168"/>
-            <w:shd w:fill="F0F4F8"/>
-            <w:tcMar>
-              <w:top w:w="80" w:type="dxa"/>
-              <w:bottom w:w="80" w:type="dxa"/>
-              <w:left w:w="100" w:type="dxa"/>
-              <w:right w:w="100" w:type="dxa"/>
-            </w:tcMar>
-          </w:tcPr>
-          <w:p>
-            <w:r>
-              <w:rPr>
-                <w:b/>
-                <w:color w:val="1B365D"/>
-              </w:rPr>
-              <w:t>Domain:</w:t>
-            </w:r>
-          </w:p>
-        </w:tc>
-        <w:tc>
-          <w:tcPr>
-            <w:tcW w:type="dxa" w:w="5472"/>
-            <w:shd w:fill="FFFFFF"/>
-            <w:tcMar>
-              <w:top w:w="80" w:type="dxa"/>
-              <w:bottom w:w="80" w:type="dxa"/>
-              <w:left w:w="100" w:type="dxa"/>
-              <w:right w:w="100" w:type="dxa"/>
-            </w:tcMar>
-          </w:tcPr>
-          <w:p>
-            <w:r>
-              <w:t>Personal Finance Analytics &amp; Applied AI</w:t>
-            </w:r>
-          </w:p>
-        </w:tc>
-      </w:tr>
-      <w:tr>
-        <w:tc>
-          <w:tcPr>
-            <w:tcW w:type="dxa" w:w="3168"/>
-            <w:shd w:fill="F0F4F8"/>
-            <w:tcMar>
-              <w:top w:w="80" w:type="dxa"/>
-              <w:bottom w:w="80" w:type="dxa"/>
-              <w:left w:w="100" w:type="dxa"/>
-              <w:right w:w="100" w:type="dxa"/>
-            </w:tcMar>
-          </w:tcPr>
-          <w:p>
-            <w:r>
-              <w:rPr>
-                <w:b/>
-                <w:color w:val="1B365D"/>
-              </w:rPr>
-              <w:t>Academic Year:</w:t>
-            </w:r>
-          </w:p>
-        </w:tc>
-        <w:tc>
-          <w:tcPr>
-            <w:tcW w:type="dxa" w:w="5472"/>
-            <w:shd w:fill="FFFFFF"/>
-            <w:tcMar>
-              <w:top w:w="80" w:type="dxa"/>
-              <w:bottom w:w="80" w:type="dxa"/>
-              <w:left w:w="100" w:type="dxa"/>
-              <w:right w:w="100" w:type="dxa"/>
-            </w:tcMar>
-          </w:tcPr>
-          <w:p>
-            <w:r>
-              <w:t>2024–2025</w:t>
+              <w:t>Electronics and Telecommunication Engineering</w:t>
             </w:r>
           </w:p>
         </w:tc>

</xml_diff>

<commit_message>
Update project report with verified numbers matching final notebook
</commit_message>
<xml_diff>
--- a/Pranav_ProjectReport.docx
+++ b/Pranav_ProjectReport.docx
@@ -203,12 +203,12 @@
     </w:p>
     <w:p>
       <w:r>
-        <w:t>The system ingests 24 months of raw transaction logs (861 records), standardizes datetimes, validates numerical amounts in Indian Rupees (₹ INR), and extracts temporal features. Exploratory Data Analysis (EDA) quantifies total spend (₹58,50,831.02), median transaction size (₹3,393.87), and primary cost drivers (Rent representing 44.29% of budget). Machine Learning regression models (Linear Regression and Random Forest Regressor) are trained on monthly aggregations; Random Forest achieves superior predictive accuracy with a Test Mean Absolute Error (MAE) of ₹1,15,375.94 and forecasts January 2025 spending at ₹4,78,535.56.</w:t>
+        <w:t>The system ingests raw transaction logs (863 records), standardizes datetimes, validates numerical amounts in Indian Rupees (₹ INR), handles missing entries, and removes 2 duplicate records and 1 invalid non-positive amount row to produce a clean 860-record dataset spanning 12 months (January 2024 – December 2024). Exploratory Data Analysis (EDA) quantifies total expenditure (₹5,847,096.02), average transaction size (₹6,798.95), median transaction size (₹3,391.38), and primary cost drivers (Groceries representing 25.94% and Housing &amp; Rent representing 22.18% of total spend). Machine Learning regression models (Linear Regression and Random Forest Regressor) are trained on 11 monthly aggregations (8 training months, 3 testing months); Linear Regression achieves baseline predictive accuracy with a Test Mean Absolute Error (MAE) of ₹9,958.47 (R² = 0.9612) and forecasts January 2025 expenditure at ₹4,90,277.78 (Random Forest forecasts ₹4,74,552.23).</w:t>
       </w:r>
     </w:p>
     <w:p>
       <w:r>
-        <w:t>Furthermore, an unsupervised Isolation Forest model flags 26 unusual, high-value transactions totaling ₹19,22,074.99 for user review without requiring labeled fraud data. Finally, an interactive Streamlit web dashboard translates analytical outputs into visual charts, dynamic budget calculators, and automated spending recommendations. The resulting system demonstrates an effective fusion of predictive modeling, anomaly detection, and user-centric visualization for individual budget intelligence.</w:t>
+        <w:t>Furthermore, an unsupervised Isolation Forest model flags 26 statistical anomalies (3.02% of total records) representing ₹19,47,813.29 for user review without requiring labeled fraud data. Finally, an interactive Streamlit web dashboard translates analytical outputs into visual charts, dynamic budget calculators, and automated spending recommendations. The resulting system demonstrates an effective fusion of predictive modeling, anomaly detection, and user-centric visualization for individual budget intelligence.</w:t>
       </w:r>
     </w:p>
     <w:p>
@@ -539,7 +539,7 @@
     </w:p>
     <w:p>
       <w:r>
-        <w:t>The project utilizes the Personal Expense Transactions Dataset, representing 24 months of continuous transaction records from January 2023 through December 2024. The dataset contains 861 transaction logs converted to Indian Rupees (₹ INR) at a fixed exchange rate of 1 USD = 83.0 INR.</w:t>
+        <w:t>The project utilizes the Personal Expense Transactions Dataset, representing 12 months of continuous transaction records from January 2024 through December 2024. The raw dataset contains 863 transaction logs in Indian Rupees (₹ INR). After data cleaning (removing 2 duplicate rows and 1 non-positive amount record), the final cleaned dataset contains 860 valid records.</w:t>
       </w:r>
     </w:p>
     <w:tbl>
@@ -925,13 +925,7 @@
         <w:spacing w:after="60"/>
       </w:pPr>
       <w:r>
-        <w:rPr>
-          <w:b/>
-        </w:rPr>
-        <w:t>Converted transaction amounts to positive floats in ₹ INR; verified 0 null or negative corrupted values.</w:t>
-      </w:r>
-      <w:r>
-        <w:t xml:space="preserve">Amount Validation: </w:t>
+        <w:t>Amount Validation: Filtered transaction amounts to strictly positive values in ₹ INR (removing 1 invalid negative amount record of -₹3,735.00); removed 2 exact duplicate rows; imputed missing Payment_Method entries to 'Unspecified' and missing Description entries to 'No Description', establishing a clean 860-record dataset with zero missing values in analytical fields.</w:t>
       </w:r>
     </w:p>
     <w:p>
@@ -981,7 +975,7 @@
     </w:p>
     <w:p>
       <w:r>
-        <w:t>Exploratory Data Analysis (EDA) quantifies overall spending metrics, distributions, category allocations, and payment preferences across the 861 transaction logs.</w:t>
+        <w:t>Exploratory Data Analysis (EDA) quantifies overall spending metrics, distributions, category allocations, and payment preferences across the 860 clean transaction logs.</w:t>
       </w:r>
     </w:p>
     <w:p>
@@ -1010,13 +1004,7 @@
         <w:spacing w:after="60"/>
       </w:pPr>
       <w:r>
-        <w:rPr>
-          <w:b/>
-        </w:rPr>
-        <w:t>₹58,50,831.02 across 861 transactions.</w:t>
-      </w:r>
-      <w:r>
-        <w:t xml:space="preserve">Total Expenditure: </w:t>
+        <w:t>Total Expenditure: ₹5,847,096.02 across 860 transactions.</w:t>
       </w:r>
     </w:p>
     <w:p>
@@ -1025,13 +1013,7 @@
         <w:spacing w:after="60"/>
       </w:pPr>
       <w:r>
-        <w:rPr>
-          <w:b/>
-        </w:rPr>
-        <w:t>₹6,795.39 per transaction.</w:t>
-      </w:r>
-      <w:r>
-        <w:t xml:space="preserve">Mean Transaction Amount: </w:t>
+        <w:t>Mean Transaction Amount: ₹6,798.95 per transaction.</w:t>
       </w:r>
     </w:p>
     <w:p>
@@ -1040,13 +1022,7 @@
         <w:spacing w:after="60"/>
       </w:pPr>
       <w:r>
-        <w:rPr>
-          <w:b/>
-        </w:rPr>
-        <w:t>₹3,393.87 per transaction.</w:t>
-      </w:r>
-      <w:r>
-        <w:t xml:space="preserve">Median Transaction Amount: </w:t>
+        <w:t>Median Transaction Amount: ₹3,391.38 per transaction.</w:t>
       </w:r>
     </w:p>
     <w:p>
@@ -1055,13 +1031,7 @@
         <w:spacing w:after="60"/>
       </w:pPr>
       <w:r>
-        <w:rPr>
-          <w:b/>
-        </w:rPr>
-        <w:t>₹83.00 (Utility/Snack purchase).</w:t>
-      </w:r>
-      <w:r>
-        <w:t xml:space="preserve">Minimum Single Transaction: </w:t>
+        <w:t>Minimum Single Transaction: ₹679.77.</w:t>
       </w:r>
     </w:p>
     <w:p>
@@ -1070,13 +1040,7 @@
         <w:spacing w:after="60"/>
       </w:pPr>
       <w:r>
-        <w:rPr>
-          <w:b/>
-        </w:rPr>
-        <w:t>₹1,99,200.00 (International Vacation Booking).</w:t>
-      </w:r>
-      <w:r>
-        <w:t xml:space="preserve">Maximum Single Transaction: </w:t>
+        <w:t>Maximum Single Transaction: ₹199,200.00 (International Vacation Booking).</w:t>
       </w:r>
     </w:p>
     <w:p>
@@ -1085,13 +1049,7 @@
         <w:spacing w:after="60"/>
       </w:pPr>
       <w:r>
-        <w:rPr>
-          <w:b/>
-        </w:rPr>
-        <w:t>₹2,43,784.63 per month.</w:t>
-      </w:r>
-      <w:r>
-        <w:t xml:space="preserve">Average Monthly Spend: </w:t>
+        <w:t>Average Monthly Spend: ₹4,87,258.00 per month (across 12 months in 2024).</w:t>
       </w:r>
     </w:p>
     <w:p>
@@ -1165,7 +1123,7 @@
     </w:p>
     <w:p>
       <w:r>
-        <w:t>Monthly spending remains relatively stable across 2023 and 2024, hovering between ₹2,20,000 and ₹2,80,000 per month due to consistent recurring fixed costs (Rent).</w:t>
+        <w:t>Monthly spending across 2024 ranges from ₹3,40,582.20 (November 2024) to ₹6,86,420.79 (March 2024) and ₹6,86,180.09 (June 2024), reflecting seasonal variation and recurring fixed expenses.</w:t>
       </w:r>
     </w:p>
     <w:p>
@@ -1214,12 +1172,7 @@
         <w:jc w:val="center"/>
       </w:pPr>
       <w:r>
-        <w:rPr>
-          <w:i/>
-          <w:color w:val="555555"/>
-          <w:sz w:val="19"/>
-        </w:rPr>
-        <w:t>Figure 2: 24-Month Expenditure Trendline (January 2023 – December 2024)</w:t>
+        <w:t>Figure 2: 12-Month Expenditure Trendline (January 2024 – December 2024)</w:t>
       </w:r>
     </w:p>
     <w:p>
@@ -1248,13 +1201,7 @@
         <w:spacing w:after="60"/>
       </w:pPr>
       <w:r>
-        <w:rPr>
-          <w:b/>
-        </w:rPr>
-        <w:t>₹25,91,260.00 (44.29% of total spending, 24 monthly payments of ~₹1,07,900).</w:t>
-      </w:r>
-      <w:r>
-        <w:t xml:space="preserve">Rent: </w:t>
+        <w:t>Groceries: ₹1,516,577.66 (25.94% of total spending across 179 transactions).</w:t>
       </w:r>
     </w:p>
     <w:p>
@@ -1263,13 +1210,7 @@
         <w:spacing w:after="60"/>
       </w:pPr>
       <w:r>
-        <w:rPr>
-          <w:b/>
-        </w:rPr>
-        <w:t>₹8,45,210.00 (14.45% of budget across 210 transactions).</w:t>
-      </w:r>
-      <w:r>
-        <w:t xml:space="preserve">Food &amp; Dining: </w:t>
+        <w:t>Housing &amp; Rent: ₹1,296,583.67 (22.18% of total spending across 12 transactions).</w:t>
       </w:r>
     </w:p>
     <w:p>
@@ -1278,13 +1219,7 @@
         <w:spacing w:after="60"/>
       </w:pPr>
       <w:r>
-        <w:rPr>
-          <w:b/>
-        </w:rPr>
-        <w:t>₹6,80,120.00 (11.62% of total expenditure).</w:t>
-      </w:r>
-      <w:r>
-        <w:t xml:space="preserve">Shopping: </w:t>
+        <w:t>Food &amp; Dining: ₹857,924.52 (14.67% of budget across 350 transactions).</w:t>
       </w:r>
     </w:p>
     <w:p>
@@ -1293,13 +1228,7 @@
         <w:spacing w:after="60"/>
       </w:pPr>
       <w:r>
-        <w:rPr>
-          <w:b/>
-        </w:rPr>
-        <w:t>₹5,12,300.00 (8.76% of budget).</w:t>
-      </w:r>
-      <w:r>
-        <w:t xml:space="preserve">Travel: </w:t>
+        <w:t>Shopping: ₹708,670.60 (12.12% of total expenditure across 80 transactions).</w:t>
       </w:r>
     </w:p>
     <w:p>
@@ -1496,12 +1425,12 @@
     </w:p>
     <w:p>
       <w:r>
-        <w:t>To enable predictive budgeting, the transaction dataset was aggregated into 23 monthly records (2023-01 to 2024-11). Feature engineering created monthly predictors including transaction count, average transaction size, max transaction size, rent expenditure, and lagged previous month spend (`Prev_Month_Spend`).</w:t>
+        <w:t>To enable predictive budgeting, the transaction dataset was aggregated into 11 monthly records (2024-02 to 2024-12). Feature engineering created monthly predictors including transaction count, average transaction size, max transaction size, and lagged previous month spend (Prev_Month_Spend).</w:t>
       </w:r>
     </w:p>
     <w:p>
       <w:r>
-        <w:t>A chronological 80/20 train/test split was enforced (18 training months, 5 testing months) to preserve temporal ordering without data leakage. Two regression algorithms were trained:</w:t>
+        <w:t>A chronological 80/20 train/test split was enforced (8 training months, 3 testing months) to preserve temporal ordering without data leakage. Two regression algorithms were trained:</w:t>
       </w:r>
     </w:p>
     <w:p>
@@ -1705,7 +1634,7 @@
           </w:tcPr>
           <w:p>
             <w:r>
-              <w:t>₹1,42,850.20</w:t>
+              <w:t>₹9,958.47</w:t>
             </w:r>
           </w:p>
         </w:tc>
@@ -1722,7 +1651,7 @@
           </w:tcPr>
           <w:p>
             <w:r>
-              <w:t>2.85e+10</w:t>
+              <w:t>132,954,435.04</w:t>
             </w:r>
           </w:p>
         </w:tc>
@@ -1739,7 +1668,7 @@
           </w:tcPr>
           <w:p>
             <w:r>
-              <w:t>₹1,68,819.43</w:t>
+              <w:t>₹11,530.59</w:t>
             </w:r>
           </w:p>
         </w:tc>
@@ -1756,7 +1685,7 @@
           </w:tcPr>
           <w:p>
             <w:r>
-              <w:t>-0.4512</w:t>
+              <w:t>0.9612</w:t>
             </w:r>
           </w:p>
         </w:tc>
@@ -1792,7 +1721,7 @@
           </w:tcPr>
           <w:p>
             <w:r>
-              <w:t>₹1,15,375.94</w:t>
+              <w:t>₹49,535.24</w:t>
             </w:r>
           </w:p>
         </w:tc>
@@ -1809,7 +1738,7 @@
           </w:tcPr>
           <w:p>
             <w:r>
-              <w:t>2.70e+10</w:t>
+              <w:t>4,698,140,806.85</w:t>
             </w:r>
           </w:p>
         </w:tc>
@@ -1826,7 +1755,7 @@
           </w:tcPr>
           <w:p>
             <w:r>
-              <w:t>₹1,64,201.63</w:t>
+              <w:t>₹68,542.99</w:t>
             </w:r>
           </w:p>
         </w:tc>
@@ -1843,7 +1772,7 @@
           </w:tcPr>
           <w:p>
             <w:r>
-              <w:t>-0.3721</w:t>
+              <w:t>-0.3703</w:t>
             </w:r>
           </w:p>
         </w:tc>
@@ -1851,7 +1780,7 @@
     </w:tbl>
     <w:p>
       <w:r>
-        <w:t>Random Forest Regressor outperformed Linear Regression, reducing MAE by ₹27,474.26. The trained model projected January 2025 monthly expenditure at ₹4,78,535.56.</w:t>
+        <w:t>Linear Regression achieved strong baseline predictive accuracy, reducing MAE to ₹9,958.47 (R² = 0.9612), while Random Forest Regressor achieved a Test MAE of ₹49,535.24. The trained models projected January 2025 monthly expenditure at ₹4,90,277.78 (Linear Regression) and ₹4,74,552.23 (Random Forest Regressor). Note that these are model-generated forecasts and not guaranteed future expenses.</w:t>
       </w:r>
     </w:p>
     <w:p>
@@ -1930,7 +1859,7 @@
     </w:p>
     <w:p>
       <w:r>
-        <w:t>Out of 861 transactions, the model flagged 26 anomalies (3.02% of total records) representing ₹19,22,074.99 in expenditure. Key flagged transactions included non-routine luxury vacation packages (₹1,99,200.00), major consumer electronics purchases (₹1,45,000.00), and medical emergency costs.</w:t>
+        <w:t>Out of 860 cleaned transactions, the model flagged 26 statistical anomalies (3.02% of total records) representing ₹19,47,813.29 in expenditure. Key flagged transactions included non-routine luxury vacation packages (₹1,99,200.00), emergency laptop replacement (₹1,53,550.00), and recurring high-value monthly rent payments.</w:t>
       </w:r>
     </w:p>
     <w:p>
@@ -2013,13 +1942,7 @@
         <w:spacing w:after="60"/>
       </w:pPr>
       <w:r>
-        <w:rPr>
-          <w:b/>
-        </w:rPr>
-        <w:t>Fixed housing rent absorbs 44.29% of monthly income, necessitating strict management of variable category spend.</w:t>
-      </w:r>
-      <w:r>
-        <w:t xml:space="preserve">Budget Dominance: </w:t>
+        <w:t>Budget Dominance: Groceries (25.94%) and Housing Rent (22.18%) dominate total cash outflow, necessitating strict management of variable category spend.</w:t>
       </w:r>
     </w:p>
     <w:p>
@@ -2028,13 +1951,7 @@
         <w:spacing w:after="60"/>
       </w:pPr>
       <w:r>
-        <w:rPr>
-          <w:b/>
-        </w:rPr>
-        <w:t>January 2025 predicted outflow of ₹4,78,535.56 advises setting aside a dedicated liquid buffer.</w:t>
-      </w:r>
-      <w:r>
-        <w:t xml:space="preserve">Predictive Forecast Alert: </w:t>
+        <w:t>Predictive Forecast Alert: January 2025 predicted baseline outflow of ₹4,90,277.78 (Linear Regression) / ₹4,74,552.23 (Random Forest) advises setting aside a dedicated liquid buffer.</w:t>
       </w:r>
     </w:p>
     <w:p>
@@ -2043,13 +1960,7 @@
         <w:spacing w:after="60"/>
       </w:pPr>
       <w:r>
-        <w:rPr>
-          <w:b/>
-        </w:rPr>
-        <w:t>26 transactions totaling ₹19,22,074.99 flagged for manual authorization review.</w:t>
-      </w:r>
-      <w:r>
-        <w:t xml:space="preserve">Anomaly Warning: </w:t>
+        <w:t>Anomaly Warning: 26 transactions totaling ₹19,47,813.29 flagged for manual authorization review as statistical anomalies.</w:t>
       </w:r>
     </w:p>
     <w:p>
@@ -2058,13 +1969,7 @@
         <w:spacing w:after="60"/>
       </w:pPr>
       <w:r>
-        <w:rPr>
-          <w:b/>
-        </w:rPr>
-        <w:t>Recommends maintaining an emergency liquid fund of at least ₹14,00,000 (3x monthly spend).</w:t>
-      </w:r>
-      <w:r>
-        <w:t xml:space="preserve">Emergency Fund Sizing: </w:t>
+        <w:t>Emergency Fund Sizing: Recommends maintaining an emergency liquid fund of at least ₹14,60,000 (3x average monthly spend).</w:t>
       </w:r>
     </w:p>
     <w:p>
@@ -2690,13 +2595,7 @@
         <w:spacing w:after="60"/>
       </w:pPr>
       <w:r>
-        <w:rPr>
-          <w:b/>
-        </w:rPr>
-        <w:t>₹58,50,831.02 across 861 transactions spanning 2023–2024.</w:t>
-      </w:r>
-      <w:r>
-        <w:t xml:space="preserve">Cleaned Total Outflow: </w:t>
+        <w:t>Cleaned Total Outflow: ₹5,847,096.02 across 860 valid transactions spanning 12 months in 2024.</w:t>
       </w:r>
     </w:p>
     <w:p>
@@ -2705,13 +2604,7 @@
         <w:spacing w:after="60"/>
       </w:pPr>
       <w:r>
-        <w:rPr>
-          <w:b/>
-        </w:rPr>
-        <w:t>Rent is the single largest cost driver (₹25,91,260.00, 44.29% of budget).</w:t>
-      </w:r>
-      <w:r>
-        <w:t xml:space="preserve">Dominant Expense: </w:t>
+        <w:t>Dominant Expense: Groceries (₹1,516,577.66, 25.94% of budget) and Housing &amp; Rent (₹1,296,583.67, 22.18% of budget).</w:t>
       </w:r>
     </w:p>
     <w:p>
@@ -2720,13 +2613,7 @@
         <w:spacing w:after="60"/>
       </w:pPr>
       <w:r>
-        <w:rPr>
-          <w:b/>
-        </w:rPr>
-        <w:t>Random Forest Regressor achieved a Test MAE of ₹1,15,375.94, outperforming Linear Regression.</w:t>
-      </w:r>
-      <w:r>
-        <w:t xml:space="preserve">ML Predictive Model: </w:t>
+        <w:t>ML Predictive Model: Linear Regression achieved a Test MAE of ₹9,958.47 (R² = 0.9612).</w:t>
       </w:r>
     </w:p>
     <w:p>
@@ -2735,13 +2622,7 @@
         <w:spacing w:after="60"/>
       </w:pPr>
       <w:r>
-        <w:rPr>
-          <w:b/>
-        </w:rPr>
-        <w:t>Projected monthly spending of ₹4,78,535.56.</w:t>
-      </w:r>
-      <w:r>
-        <w:t xml:space="preserve">January 2025 Forecast: </w:t>
+        <w:t>January 2025 Forecast: Projected monthly spending of ₹4,90,277.78 (Linear Regression) and ₹4,74,552.23 (Random Forest).</w:t>
       </w:r>
     </w:p>
     <w:p>
@@ -2750,13 +2631,7 @@
         <w:spacing w:after="60"/>
       </w:pPr>
       <w:r>
-        <w:rPr>
-          <w:b/>
-        </w:rPr>
-        <w:t>Isolation Forest flagged 26 non-routine transactions totaling ₹19,22,074.99.</w:t>
-      </w:r>
-      <w:r>
-        <w:t xml:space="preserve">Anomaly Identification: </w:t>
+        <w:t>Anomaly Identification: Isolation Forest flagged 26 non-routine statistical anomalies totaling ₹19,47,813.29 (3.02% of total records).</w:t>
       </w:r>
     </w:p>
     <w:p>
@@ -2780,13 +2655,7 @@
         <w:spacing w:after="60"/>
       </w:pPr>
       <w:r>
-        <w:rPr>
-          <w:b/>
-        </w:rPr>
-        <w:t>Monthly dataset aggregation yielded 23 samples for ML regression, limiting deep complex neural network applications.</w:t>
-      </w:r>
-      <w:r>
-        <w:t xml:space="preserve">Sample Size Constraints: </w:t>
+        <w:t>Sample Size Constraints: Monthly dataset aggregation yielded 11 samples for ML regression (8 training records, 3 testing records), which limits long-term generalization and complex neural network applications.</w:t>
       </w:r>
     </w:p>
     <w:p>
@@ -2810,13 +2679,7 @@
         <w:spacing w:after="60"/>
       </w:pPr>
       <w:r>
-        <w:rPr>
-          <w:b/>
-        </w:rPr>
-        <w:t>Isolation Forest flags statistical outliers, which require human context to distinguish legitimate large purchases from errors.</w:t>
-      </w:r>
-      <w:r>
-        <w:t xml:space="preserve">Unsupervised Anomaly Assumptions: </w:t>
+        <w:t>1. Ingested, cleaned, and validated 863 raw transaction logs into Indian Rupees (₹ INR), establishing a clean 860-record dataset.</w:t>
       </w:r>
     </w:p>
     <w:p>
@@ -2840,13 +2703,7 @@
         <w:spacing w:after="60"/>
       </w:pPr>
       <w:r>
-        <w:rPr>
-          <w:b/>
-        </w:rPr>
-        <w:t>Connect directly with Plaid / Open Banking APIs for dynamic daily sync.</w:t>
-      </w:r>
-      <w:r>
-        <w:t xml:space="preserve">Real-Time Banking API Integration: </w:t>
+        <w:t>3. Built and evaluated predictive regression models on 11 monthly records (8 training / 3 testing), establishing Linear Regression as an accurate monthly forecasting baseline (Test MAE ₹9,958.47, R² = 0.9612) and generating January 2025 forecasts (₹4,90,277.78 LR / ₹4,74,552.23 RF).</w:t>
       </w:r>
     </w:p>
     <w:p>
@@ -2855,13 +2712,7 @@
         <w:spacing w:after="60"/>
       </w:pPr>
       <w:r>
-        <w:rPr>
-          <w:b/>
-        </w:rPr>
-        <w:t>Train separate sub-models for Food, Travel, and Shopping categories.</w:t>
-      </w:r>
-      <w:r>
-        <w:t xml:space="preserve">Category-Level Granular Forecasting: </w:t>
+        <w:t>4. Applied unsupervised Isolation Forest anomaly detection to isolate 26 high-value statistical outlier transactions totaling ₹19,47,813.29.</w:t>
       </w:r>
     </w:p>
     <w:p>
@@ -2916,13 +2767,13 @@
     </w:p>
     <w:p>
       <w:r>
-        <w:t>1. Ingested, cleaned, and standardized 861 transaction logs into Indian Rupees (₹ INR).</w:t>
+        <w:t>1. Ingested, cleaned, and validated 863 raw transaction logs into Indian Rupees (₹ INR), establishing a clean 860-record dataset.</w:t>
         <w:br/>
         <w:t>2. Conducted thorough exploratory analysis revealing spending distributions, category breakdowns, and monthly trends.</w:t>
         <w:br/>
-        <w:t>3. Built and evaluated predictive regression models, establishing Random Forest as an accurate monthly forecasting tool (MAE ₹1,15,375.94).</w:t>
+        <w:t>3. Built and evaluated predictive regression models on 11 monthly records (8 training / 3 testing), establishing Linear Regression as an accurate monthly forecasting baseline (Test MAE ₹9,958.47, R² = 0.9612) and generating January 2025 forecasts (₹4,90,277.78 LR / ₹4,74,552.23 RF).</w:t>
         <w:br/>
-        <w:t>4. Applied unsupervised Isolation Forest anomaly detection to isolate 26 high-value outlier transactions.</w:t>
+        <w:t>4. Applied unsupervised Isolation Forest anomaly detection to isolate 26 high-value statistical outlier transactions totaling ₹19,47,813.29.</w:t>
         <w:br/>
         <w:t>5. Deployed a full-featured Streamlit web application providing interactive analytics, budget simulations, and automated insights.</w:t>
       </w:r>

</xml_diff>

<commit_message>
Apply minor corrections: fix test set description, dataset category examples, and future scope section
</commit_message>
<xml_diff>
--- a/Pranav_ProjectReport.docx
+++ b/Pranav_ProjectReport.docx
@@ -719,7 +719,7 @@
           </w:tcPr>
           <w:p>
             <w:r>
-              <w:t>Expense category (Rent, Food &amp; Dining, Shopping, Travel, etc.).</w:t>
+              <w:t>Expense category (Groceries, Housing &amp; Rent, Food &amp; Dining, Shopping).</w:t>
             </w:r>
           </w:p>
         </w:tc>
@@ -1192,7 +1192,7 @@
     </w:p>
     <w:p>
       <w:r>
-        <w:t>Expenditure is heavily dominated by Rent, followed by Food &amp; Dining and Shopping:</w:t>
+        <w:t>Expenditure is heavily dominated by Groceries, followed by Housing &amp; Rent, Food &amp; Dining, and Shopping:</w:t>
       </w:r>
     </w:p>
     <w:p>
@@ -1480,7 +1480,7 @@
     </w:p>
     <w:p>
       <w:r>
-        <w:t>Models were evaluated on the 5-month unseen test set using Mean Absolute Error (MAE), Root Mean Squared Error (RMSE), and R² Score:</w:t>
+        <w:t>Models were evaluated on the 3-month unseen test set using Mean Absolute Error (MAE), Root Mean Squared Error (RMSE), and R² Score:</w:t>
       </w:r>
     </w:p>
     <w:tbl>
@@ -2675,15 +2675,6 @@
     </w:p>
     <w:p>
       <w:pPr>
-        <w:pStyle w:val="ListBullet"/>
-        <w:spacing w:after="60"/>
-      </w:pPr>
-      <w:r>
-        <w:t>1. Ingested, cleaned, and validated 863 raw transaction logs into Indian Rupees (₹ INR), establishing a clean 860-record dataset.</w:t>
-      </w:r>
-    </w:p>
-    <w:p>
-      <w:pPr>
         <w:keepNext/>
         <w:spacing w:before="280" w:after="120"/>
       </w:pPr>
@@ -2703,16 +2694,16 @@
         <w:spacing w:after="60"/>
       </w:pPr>
       <w:r>
-        <w:t>3. Built and evaluated predictive regression models on 11 monthly records (8 training / 3 testing), establishing Linear Regression as an accurate monthly forecasting baseline (Test MAE ₹9,958.47, R² = 0.9612) and generating January 2025 forecasts (₹4,90,277.78 LR / ₹4,74,552.23 RF).</w:t>
+        <w:rPr>
+          <w:b/>
+        </w:rPr>
+        <w:t xml:space="preserve">Automated Push Alerts: </w:t>
       </w:r>
-    </w:p>
-    <w:p>
-      <w:pPr>
-        <w:pStyle w:val="ListBullet"/>
-        <w:spacing w:after="60"/>
-      </w:pPr>
       <w:r>
-        <w:t>4. Applied unsupervised Isolation Forest anomaly detection to isolate 26 high-value statistical outlier transactions totaling ₹19,47,813.29.</w:t>
+        <w:rPr>
+          <w:b w:val="0"/>
+        </w:rPr>
+        <w:t>Integrate SMS / WhatsApp bot webhooks for instant anomaly notifications.</w:t>
       </w:r>
     </w:p>
     <w:p>
@@ -2724,25 +2715,13 @@
         <w:rPr>
           <w:b/>
         </w:rPr>
-        <w:t>Integrate SMS / WhatsApp bot webhooks for instant anomaly notifications.</w:t>
+        <w:t xml:space="preserve">Cloud Containerization: </w:t>
       </w:r>
       <w:r>
-        <w:t xml:space="preserve">Automated Push Alerts: </w:t>
-      </w:r>
-    </w:p>
-    <w:p>
-      <w:pPr>
-        <w:pStyle w:val="ListBullet"/>
-        <w:spacing w:after="60"/>
-      </w:pPr>
-      <w:r>
         <w:rPr>
-          <w:b/>
+          <w:b w:val="0"/>
         </w:rPr>
-        <w:t>Package app using Docker for seamless deployment on AWS Elastic Beanstalk.</w:t>
-      </w:r>
-      <w:r>
-        <w:t xml:space="preserve">Cloud Containerization: </w:t>
+        <w:t>Package the application using Docker for cloud deployment.</w:t>
       </w:r>
     </w:p>
     <w:p>

</xml_diff>